<commit_message>
docs(adr-005): reconcile to v2.4 (no DR-model change); docs(adr): mark all ADRs reconciled to v2.4
</commit_message>
<xml_diff>
--- a/docs/adr/acrme_adr_005_distributed_dr_reference_model.docx
+++ b/docs/adr/acrme_adr_005_distributed_dr_reference_model.docx
@@ -49,7 +49,7 @@
         <w:t xml:space="preserve"> </w:t>
       </w:r>
       <w:r>
-        <w:t xml:space="preserve">1.0</w:t>
+        <w:t xml:space="preserve">1.1</w:t>
       </w:r>
       <w:r>
         <w:br/>
@@ -65,7 +65,7 @@
         <w:t xml:space="preserve"> </w:t>
       </w:r>
       <w:r>
-        <w:t xml:space="preserve">2 September 2026</w:t>
+        <w:t xml:space="preserve">7 September 2026</w:t>
       </w:r>
       <w:r>
         <w:br/>
@@ -81,7 +81,7 @@
         <w:t xml:space="preserve"> </w:t>
       </w:r>
       <w:r>
-        <w:t xml:space="preserve">Accepted - new ADR introduced with Requirements Baseline v2.2</w:t>
+        <w:t xml:space="preserve">Accepted - new ADR introduced with Requirements Baseline v2.2; reconciled to Baseline v2.4 (no DR-model change)</w:t>
       </w:r>
       <w:r>
         <w:br/>
@@ -97,7 +97,7 @@
         <w:t xml:space="preserve"> </w:t>
       </w:r>
       <w:r>
-        <w:t xml:space="preserve">ACRME Architecture Decision Records - aligned to Capacity &amp; Quota Management Requirements Baseline v2.2.</w:t>
+        <w:t xml:space="preserve">ACRME Architecture Decision Records - aligned to Capacity &amp; Quota Management Requirements Baseline v2.4.</w:t>
       </w:r>
     </w:p>
     <w:p>
@@ -115,7 +115,7 @@
         <w:t xml:space="preserve"> </w:t>
       </w:r>
       <w:r>
-        <w:t xml:space="preserve">An Architecture Decision Record captures a significant architectural decision, the context that forced it, the options considered, the choice made, and its consequences. This ADR consolidates the distributed DR reference model (§12A of the requirements baseline) that was previously distributed across ADR-003 and the calculation logic reference. Evidence tags:</w:t>
+        <w:t xml:space="preserve">An Architecture Decision Record captures a significant architectural decision, the context that forced it, the options considered, the choice made, and its consequences. This ADR consolidates the distributed DR reference model (Section 12A of the requirements baseline) that was previously distributed across ADR-003 and the calculation logic reference. Evidence tags:</w:t>
       </w:r>
       <w:r>
         <w:t xml:space="preserve"> </w:t>
@@ -164,6 +164,115 @@
       </w:r>
       <w:r>
         <w:t xml:space="preserve">.</w:t>
+      </w:r>
+    </w:p>
+    <w:p>
+      <w:pPr>
+        <w:pStyle w:val="BlockText"/>
+      </w:pPr>
+      <w:r>
+        <w:rPr>
+          <w:bCs/>
+          <w:b/>
+        </w:rPr>
+        <w:t xml:space="preserve">v2.4 reconciliation note — no DR-model change.</w:t>
+      </w:r>
+      <w:r>
+        <w:t xml:space="preserve"> </w:t>
+      </w:r>
+      <w:r>
+        <w:t xml:space="preserve">The distributed, reciprocal DR reference model, max-not-sum destination sizing (DR-017), the</w:t>
+      </w:r>
+      <w:r>
+        <w:t xml:space="preserve"> </w:t>
+      </w:r>
+      <w:r>
+        <w:rPr>
+          <w:rStyle w:val="VerbatimChar"/>
+        </w:rPr>
+        <w:t xml:space="preserve">SourceDestinationDRIndex</w:t>
+      </w:r>
+      <w:r>
+        <w:t xml:space="preserve"> </w:t>
+      </w:r>
+      <w:r>
+        <w:t xml:space="preserve">(DR-018), the reference topology and the Middle East</w:t>
+      </w:r>
+      <w:r>
+        <w:t xml:space="preserve"> </w:t>
+      </w:r>
+      <w:r>
+        <w:rPr>
+          <w:rStyle w:val="VerbatimChar"/>
+        </w:rPr>
+        <w:t xml:space="preserve">DR_NOT_OFFERED</w:t>
+      </w:r>
+      <w:r>
+        <w:t xml:space="preserve"> </w:t>
+      </w:r>
+      <w:r>
+        <w:t xml:space="preserve">carve-out (DR-014, DEC-001) are</w:t>
+      </w:r>
+      <w:r>
+        <w:t xml:space="preserve"> </w:t>
+      </w:r>
+      <w:r>
+        <w:rPr>
+          <w:bCs/>
+          <w:b/>
+        </w:rPr>
+        <w:t xml:space="preserve">unchanged</w:t>
+      </w:r>
+      <w:r>
+        <w:t xml:space="preserve"> </w:t>
+      </w:r>
+      <w:r>
+        <w:t xml:space="preserve">by Baseline v2.4. v2.4 folds in only the</w:t>
+      </w:r>
+      <w:r>
+        <w:t xml:space="preserve"> </w:t>
+      </w:r>
+      <w:r>
+        <w:rPr>
+          <w:iCs/>
+          <w:i/>
+        </w:rPr>
+        <w:t xml:space="preserve">reservation-model</w:t>
+      </w:r>
+      <w:r>
+        <w:t xml:space="preserve"> </w:t>
+      </w:r>
+      <w:r>
+        <w:t xml:space="preserve">gaps (seed matrix CAP-022, per-AZ CRG structure CAP-023, reactive discovery CAP-024, Availability-Set ineligibility CAP-020/021, even zone distribution PLC-011, naming OPS-006/C-12), none of which alter this reference model. Where DR sizing is applied</w:t>
+      </w:r>
+      <w:r>
+        <w:t xml:space="preserve"> </w:t>
+      </w:r>
+      <w:r>
+        <w:rPr>
+          <w:bCs/>
+          <w:b/>
+        </w:rPr>
+        <w:t xml:space="preserve">per zone</w:t>
+      </w:r>
+      <w:r>
+        <w:t xml:space="preserve">, the per-zone floors are held in the destination’s per-AZ CRGs (CAP-023) and are kept balanced by the PLC-011 even-distribution target — see ADR-003</w:t>
+      </w:r>
+      <w:r>
+        <w:t xml:space="preserve"> </w:t>
+      </w:r>
+      <w:r>
+        <w:rPr>
+          <w:iCs/>
+          <w:i/>
+        </w:rPr>
+        <w:t xml:space="preserve">DR Sizing Formula</w:t>
+      </w:r>
+      <w:r>
+        <w:t xml:space="preserve"> </w:t>
+      </w:r>
+      <w:r>
+        <w:t xml:space="preserve">for that cross-reference.</w:t>
       </w:r>
     </w:p>
     <w:p>
@@ -310,7 +419,7 @@
         <w:t xml:space="preserve"> </w:t>
       </w:r>
       <w:r>
-        <w:t xml:space="preserve">(§12A). At platform scale, dedicating a fixed 30-40% standby copy of every production region is prohibitively expensive and does not reflect the operating assumption that</w:t>
+        <w:t xml:space="preserve">(Section 12A). At platform scale, dedicating a fixed 30-40% standby copy of every production region is prohibitively expensive and does not reflect the operating assumption that</w:t>
       </w:r>
       <w:r>
         <w:t xml:space="preserve"> </w:t>
@@ -434,7 +543,7 @@
         <w:t xml:space="preserve">reference model itself</w:t>
       </w:r>
       <w:r>
-        <w:t xml:space="preserve">: the topology, the authoritative source→destination mapping, the destination-sizing boundary, the single-failure assumption, and the observability contract that makes the model auditable. It is the design anchor for the §12A worked example and the</w:t>
+        <w:t xml:space="preserve">: the topology, the authoritative source→destination mapping, the destination-sizing boundary, the single-failure assumption, and the observability contract that makes the model auditable. It is the design anchor for the Section 12A worked example and the</w:t>
       </w:r>
       <w:r>
         <w:t xml:space="preserve"> </w:t>
@@ -1018,7 +1127,7 @@
         <w:t xml:space="preserve"> </w:t>
       </w:r>
       <w:r>
-        <w:t xml:space="preserve">(baseline §2 Strategic Drivers, §5.2 Out of Scope</w:t>
+        <w:t xml:space="preserve">(baseline Section 2 Strategic Drivers, Section 5.2 Out of Scope</w:t>
       </w:r>
       <w:r>
         <w:t xml:space="preserve"> </w:t>
@@ -1033,7 +1142,7 @@
         <w:t xml:space="preserve">”</w:t>
       </w:r>
       <w:r>
-        <w:t xml:space="preserve">, §6</w:t>
+        <w:t xml:space="preserve">, Section 6</w:t>
       </w:r>
       <w:r>
         <w:t xml:space="preserve"> </w:t>
@@ -1074,7 +1183,7 @@
         <w:t xml:space="preserve">legal/business decision, DEC-001</w:t>
       </w:r>
       <w:r>
-        <w:t xml:space="preserve">, and one of the programme’s remaining major architectural risks (baseline §25).</w:t>
+        <w:t xml:space="preserve">, and one of the programme’s remaining major architectural risks (baseline Section 25).</w:t>
       </w:r>
     </w:p>
     <w:p>
@@ -1542,7 +1651,7 @@
         <w:pStyle w:val="FirstParagraph"/>
       </w:pPr>
       <w:r>
-        <w:t xml:space="preserve">The reference footprint used in the §12A worked example spans three regions (R1, R2, R3). Each region carries its own production and CVAL workloads and hosts distributed DR standby for the</w:t>
+        <w:t xml:space="preserve">The reference footprint used in the Section 12A worked example spans three regions (R1, R2, R3). Each region carries its own production and CVAL workloads and hosts distributed DR standby for the</w:t>
       </w:r>
       <w:r>
         <w:t xml:space="preserve"> </w:t>
@@ -1593,7 +1702,7 @@
           <w:iCs/>
           <w:i/>
         </w:rPr>
-        <w:t xml:space="preserve">Figure 1. Distributed DR reference model (§12A worked example). Each region simultaneously hosts Prod, CVAL, and DR standby for other source regions; every DR standby cell is tagged with its</w:t>
+        <w:t xml:space="preserve">Figure 1. Distributed DR reference model (Section 12A worked example). Each region simultaneously hosts Prod, CVAL, and DR standby for other source regions; every DR standby cell is tagged with its</w:t>
       </w:r>
       <w:r>
         <w:rPr>
@@ -2542,13 +2651,13 @@
       </w:r>
     </w:p>
     <w:bookmarkEnd w:id="25"/>
-    <w:bookmarkStart w:id="26" w:name="worked-example-12a"/>
+    <w:bookmarkStart w:id="26" w:name="worked-example-section-12a"/>
     <w:p>
       <w:pPr>
         <w:pStyle w:val="Heading2"/>
       </w:pPr>
       <w:r>
-        <w:t xml:space="preserve">Worked Example (§12A)</w:t>
+        <w:t xml:space="preserve">Worked Example (Section 12A)</w:t>
       </w:r>
     </w:p>
     <w:p>

</xml_diff>